<commit_message>
schema: open MeterType, CommandType and EventType lists, add PhaseCount (review Σ1-Σ4)
Answers the Phase A review of the second Claude (PR #2 comment, A5/A6):
- Σ1: METER_MODEL.MeterType has no fixed list and the new PhaseCount
  (1-3) carries the phase rule R12 (S36, S60); two new tests.
- Σ2 (option a): CommandType and EventType have no fixed list; the
  Load shed and Unmatched packet CHECKs still hold.
- Σ3: the GDPR assumption says what is deleted for good and what stays.
- Σ4: docx and playwright in er-model/package.json with a lockfile.
The review is kept in reviews/phase-a-A5-A6.md with the answers; A5/A6
are marked done. Regenerated create.sql, test.sql, both .erdplus files,
the HTML pages, the ER render and phase-a.docx; 76/76 tests pass on
SQL Server 2025 CU9.

Co-Authored-By: Claude Opus 5.5 (1M context) <noreply@anthropic.com>
Claude-Session: https://claude.ai/code/session_01VU2NhTqL5JCdkxvnJAX8YD
</commit_message>
<xml_diff>
--- a/deliverables/phase-a/phase-a.docx
+++ b/deliverables/phase-a/phase-a.docx
@@ -383,7 +383,7 @@
           <w:sz w:val="19"/>
           <w:szCs w:val="19"/>
         </w:rPr>
-        <w:t xml:space="preserve">Ένα εγκεκριμένο αίτημα GDPR μειώνει τη διατήρηση των ακατέργαστων δεδομένων σε 1 μήνα· ο λογαριασμός, τα τιμολόγια, οι πληρωμές και τα συγκεντρωτικά διατηρούνται.</w:t>
+        <w:t xml:space="preserve">Ένα εγκεκριμένο αίτημα GDPR διαγράφει μόνιμα τα προσωπικά δεδομένα που επιτρέπεται: τις ακατέργαστες μετρήσεις και τα πακέτα του καταναλωτή που είναι παλαιότερα του 1 μήνα. Ο λογαριασμός μένει, γιατί ο καταναλωτής παραμένει χρήστης· τα τιμολόγια, οι πληρωμές και τα συγκεντρωτικά διατηρούνται για λογιστικούς λόγους.</w:t>
       </w:r>
     </w:p>
     <w:p>
@@ -495,7 +495,7 @@
           <w:sz w:val="19"/>
           <w:szCs w:val="19"/>
         </w:rPr>
-        <w:t xml:space="preserve">Το σχήμα προκύπτει από το διάγραμμα ER με την αντιστοίχιση του βιβλίου (Elmasri &amp; Navathe, κεφ. 9): 62 πίνακες με τύπους δεδομένων T-SQL, πρωτεύοντα και ξένα κλειδιά (101), περιορισμούς CHECK (108), UNIQUE (18 και 3 φιλτραρισμένοι) και DEFAULT. Κάθε περιορισμός έχει όνομα της μορφής PK_, FK_ΠΙΝΑΚΑΣ_ΣΥΣΧΕΤΙΣΗ, UQ_, CK_, DF_. Το σχήμα δοκιμάστηκε σε Microsoft SQL Server 2025 με 74 ελέγχους περιορισμών.</w:t>
+        <w:t xml:space="preserve">Το σχήμα προκύπτει από το διάγραμμα ER με την αντιστοίχιση του βιβλίου (Elmasri &amp; Navathe, κεφ. 9): 62 πίνακες με τύπους δεδομένων T-SQL, πρωτεύοντα και ξένα κλειδιά (101), περιορισμούς CHECK (106), UNIQUE (18 και 3 φιλτραρισμένοι) και DEFAULT. Κάθε περιορισμός έχει όνομα της μορφής PK_, FK_ΠΙΝΑΚΑΣ_ΣΥΣΧΕΤΙΣΗ, UQ_, CK_, DF_. Το σχήμα δοκιμάστηκε σε Microsoft SQL Server 2025 με 76 ελέγχους περιορισμών.</w:t>
       </w:r>
     </w:p>
     <w:p>
@@ -3095,7 +3095,20 @@
           <w:sz w:val="14"/>
           <w:szCs w:val="14"/>
         </w:rPr>
-        <w:t xml:space="preserve">    MeterType VARCHAR(12) NOT NULL CONSTRAINT CK_METER_MODEL_MeterType CHECK (MeterType IN ('Single-Phase', 'Three-Phase')),</w:t>
+        <w:t xml:space="preserve">    MeterType VARCHAR(30) NOT NULL,</w:t>
+      </w:r>
+    </w:p>
+    <w:p>
+      <w:pPr>
+        <w:spacing w:after="0" w:line="220"/>
+      </w:pPr>
+      <w:r>
+        <w:rPr>
+          <w:rFonts w:ascii="Consolas" w:cs="Consolas" w:eastAsia="Consolas" w:hAnsi="Consolas"/>
+          <w:sz w:val="14"/>
+          <w:szCs w:val="14"/>
+        </w:rPr>
+        <w:t xml:space="preserve">    PhaseCount TINYINT NOT NULL CONSTRAINT CK_METER_MODEL_PhaseCount CHECK (PhaseCount BETWEEN 1 AND 3),</w:t>
       </w:r>
     </w:p>
     <w:p>
@@ -7827,7 +7840,7 @@
           <w:sz w:val="14"/>
           <w:szCs w:val="14"/>
         </w:rPr>
-        <w:t xml:space="preserve">    EventType VARCHAR(21) NOT NULL CONSTRAINT CK_EVENT_EventType CHECK (EventType IN ('Undervoltage', 'Overvoltage', 'Communication failure', 'Unmatched packet', 'Tamper', 'Suspected theft')),</w:t>
+        <w:t xml:space="preserve">    EventType VARCHAR(30) NOT NULL,</w:t>
       </w:r>
     </w:p>
     <w:p>
@@ -8698,7 +8711,7 @@
           <w:sz w:val="14"/>
           <w:szCs w:val="14"/>
         </w:rPr>
-        <w:t xml:space="preserve">    CommandType VARCHAR(16) NOT NULL CONSTRAINT CK_REMOTE_COMMAND_CommandType CHECK (CommandType IN ('Disconnect', 'Reconnect', 'Firmware upgrade', 'Load shed')),</w:t>
+        <w:t xml:space="preserve">    CommandType VARCHAR(30) NOT NULL,</w:t>
       </w:r>
     </w:p>
     <w:p>

</xml_diff>

<commit_message>
doc: draw the tables from the SQL Server 2025 catalog in the Phase A document
The nine relational-diagram-N.png (one per ER area) come from the live database after
running create.sql (sys.tables, sys.columns, sys.foreign_keys), made by the review thread
with deliverables/phase-a/sqlserver-diagram/render.py. phase-a-doc.js now titles section 3
"tables in SQL Server 2025", explains where the diagrams come from and captions each one
with its area. mdms-relational.erdplus stays in the repo as an extra; review item Σ7 no
longer applies. COLLABORATION.md: A7(β) done.

Co-Authored-By: Claude Opus 5.5 (1M context) <noreply@anthropic.com>
Claude-Session: https://claude.ai/code/session_01VU2NhTqL5JCdkxvnJAX8YD
</commit_message>
<xml_diff>
--- a/deliverables/phase-a/phase-a.docx
+++ b/deliverables/phase-a/phase-a.docx
@@ -143,7 +143,21 @@
           <w:sz w:val="21"/>
           <w:szCs w:val="21"/>
         </w:rPr>
-        <w:t xml:space="preserve">3. Σχεσιακό σχήμα (T-SQL)</w:t>
+        <w:t xml:space="preserve">3. Σχεσιακό σχήμα: πίνακες στον SQL Server 2025</w:t>
+      </w:r>
+    </w:p>
+    <w:p>
+      <w:pPr>
+        <w:spacing w:after="80"/>
+        <w:jc w:val="center"/>
+      </w:pPr>
+      <w:r>
+        <w:rPr>
+          <w:rFonts w:ascii="Calibri" w:cs="Calibri" w:eastAsia="Calibri" w:hAnsi="Calibri"/>
+          <w:sz w:val="21"/>
+          <w:szCs w:val="21"/>
+        </w:rPr>
+        <w:t xml:space="preserve">4. Σχεσιακό σχήμα σε T-SQL</w:t>
       </w:r>
     </w:p>
     <w:p>
@@ -191,7 +205,7 @@
                     </pic:cNvPicPr>
                   </pic:nvPicPr>
                   <pic:blipFill>
-                    <a:blip r:embed="rId10" cstate="none"/>
+                    <a:blip r:embed="rId11" cstate="none"/>
                     <a:srcRect/>
                     <a:stretch>
                       <a:fillRect/>
@@ -478,7 +492,7 @@
         <w:rPr>
           <w:rFonts w:ascii="Calibri" w:cs="Calibri" w:eastAsia="Calibri" w:hAnsi="Calibri"/>
         </w:rPr>
-        <w:t xml:space="preserve">3. Σχεσιακό σχήμα (T-SQL)</w:t>
+        <w:t xml:space="preserve">3. Σχεσιακό σχήμα: πίνακες στον SQL Server 2025</w:t>
       </w:r>
     </w:p>
     <w:p>
@@ -495,6 +509,689 @@
           <w:sz w:val="19"/>
           <w:szCs w:val="19"/>
         </w:rPr>
+        <w:t xml:space="preserve">Τα διαγράμματα σχεδιάστηκαν από την ίδια τη βάση: το create.sql εκτελέστηκε σε Microsoft SQL Server 2025 (βάση mdms) και οι πίνακες, οι στήλες, οι τύποι, τα NULL, τα πρωτεύοντα και τα ξένα κλειδιά διαβάστηκαν από τον κατάλογο (sys.tables, sys.columns, sys.foreign_keys). Ένα διάγραμμα ανά περιοχή του ER, όπως το database diagram του SSMS: Key / Column Name / Data Type / Allow Nulls. Κάθε γραμμή είναι ένα ξένο κλειδί, με «πόδι κόρακα» στη μεριά «πολλά» και διπλή γραμμή στη μεριά «ένα»· οι γκρι πίνακες ανήκουν σε άλλη περιοχή. Ο πλήρης ορισμός με όλους τους περιορισμούς ακολουθεί σε T-SQL.</w:t>
+      </w:r>
+    </w:p>
+    <w:p>
+      <w:pPr>
+        <w:jc w:val="center"/>
+      </w:pPr>
+      <w:r>
+        <w:drawing>
+          <wp:inline distT="0" distB="0" distL="0" distR="0">
+            <wp:extent cx="5705475" cy="4000500"/>
+            <wp:effectExtent t="0" r="0" b="0" l="0"/>
+            <wp:docPr id="1" name="" descr="" title=""/>
+            <wp:cNvGraphicFramePr>
+              <a:graphicFrameLocks xmlns:a="http://schemas.openxmlformats.org/drawingml/2006/main" noChangeAspect="1"/>
+            </wp:cNvGraphicFramePr>
+            <a:graphic xmlns:a="http://schemas.openxmlformats.org/drawingml/2006/main">
+              <a:graphicData uri="http://schemas.openxmlformats.org/drawingml/2006/picture">
+                <pic:pic xmlns:pic="http://schemas.openxmlformats.org/drawingml/2006/picture">
+                  <pic:nvPicPr>
+                    <pic:cNvPr id="0" name="" descr=""/>
+                    <pic:cNvPicPr>
+                      <a:picLocks noChangeAspect="1" noChangeArrowheads="1"/>
+                    </pic:cNvPicPr>
+                  </pic:nvPicPr>
+                  <pic:blipFill>
+                    <a:blip r:embed="rId12" cstate="none"/>
+                    <a:srcRect/>
+                    <a:stretch>
+                      <a:fillRect/>
+                    </a:stretch>
+                  </pic:blipFill>
+                  <pic:spPr bwMode="auto">
+                    <a:xfrm>
+                      <a:off x="0" y="0"/>
+                      <a:ext cx="5705475" cy="4000500"/>
+                    </a:xfrm>
+                    <a:prstGeom prst="rect">
+                      <a:avLst/>
+                    </a:prstGeom>
+                  </pic:spPr>
+                </pic:pic>
+              </a:graphicData>
+            </a:graphic>
+          </wp:inline>
+        </w:drawing>
+      </w:r>
+    </w:p>
+    <w:p>
+      <w:pPr>
+        <w:spacing w:after="80"/>
+        <w:jc w:val="center"/>
+        <w:rPr>
+          <w:i/>
+          <w:iCs/>
+          <w:sz w:val="18"/>
+          <w:szCs w:val="18"/>
+        </w:rPr>
+      </w:pPr>
+      <w:r>
+        <w:rPr>
+          <w:rFonts w:ascii="Calibri" w:cs="Calibri" w:eastAsia="Calibri" w:hAnsi="Calibri"/>
+          <w:i/>
+          <w:iCs/>
+          <w:sz w:val="18"/>
+          <w:szCs w:val="18"/>
+        </w:rPr>
+        <w:t xml:space="preserve">Διάγραμμα 1/9: Χρήστες και ρόλοι</w:t>
+      </w:r>
+    </w:p>
+    <w:p>
+      <w:pPr>
+        <w:pageBreakBefore/>
+      </w:pPr>
+    </w:p>
+    <w:p>
+      <w:pPr>
+        <w:jc w:val="center"/>
+      </w:pPr>
+      <w:r>
+        <w:drawing>
+          <wp:inline distT="0" distB="0" distL="0" distR="0">
+            <wp:extent cx="9553575" cy="5467350"/>
+            <wp:effectExtent t="0" r="0" b="0" l="0"/>
+            <wp:docPr id="1" name="" descr="" title=""/>
+            <wp:cNvGraphicFramePr>
+              <a:graphicFrameLocks xmlns:a="http://schemas.openxmlformats.org/drawingml/2006/main" noChangeAspect="1"/>
+            </wp:cNvGraphicFramePr>
+            <a:graphic xmlns:a="http://schemas.openxmlformats.org/drawingml/2006/main">
+              <a:graphicData uri="http://schemas.openxmlformats.org/drawingml/2006/picture">
+                <pic:pic xmlns:pic="http://schemas.openxmlformats.org/drawingml/2006/picture">
+                  <pic:nvPicPr>
+                    <pic:cNvPr id="0" name="" descr=""/>
+                    <pic:cNvPicPr>
+                      <a:picLocks noChangeAspect="1" noChangeArrowheads="1"/>
+                    </pic:cNvPicPr>
+                  </pic:nvPicPr>
+                  <pic:blipFill>
+                    <a:blip r:embed="rId13" cstate="none"/>
+                    <a:srcRect/>
+                    <a:stretch>
+                      <a:fillRect/>
+                    </a:stretch>
+                  </pic:blipFill>
+                  <pic:spPr bwMode="auto">
+                    <a:xfrm>
+                      <a:off x="0" y="0"/>
+                      <a:ext cx="9553575" cy="5467350"/>
+                    </a:xfrm>
+                    <a:prstGeom prst="rect">
+                      <a:avLst/>
+                    </a:prstGeom>
+                  </pic:spPr>
+                </pic:pic>
+              </a:graphicData>
+            </a:graphic>
+          </wp:inline>
+        </w:drawing>
+      </w:r>
+    </w:p>
+    <w:p>
+      <w:pPr>
+        <w:spacing w:after="80"/>
+        <w:jc w:val="center"/>
+        <w:rPr>
+          <w:i/>
+          <w:iCs/>
+          <w:sz w:val="18"/>
+          <w:szCs w:val="18"/>
+        </w:rPr>
+      </w:pPr>
+      <w:r>
+        <w:rPr>
+          <w:rFonts w:ascii="Calibri" w:cs="Calibri" w:eastAsia="Calibri" w:hAnsi="Calibri"/>
+          <w:i/>
+          <w:iCs/>
+          <w:sz w:val="18"/>
+          <w:szCs w:val="18"/>
+        </w:rPr>
+        <w:t xml:space="preserve">Διάγραμμα 2/9: Καταναλωτές και υποστατικά</w:t>
+      </w:r>
+    </w:p>
+    <w:p>
+      <w:pPr>
+        <w:pageBreakBefore/>
+      </w:pPr>
+    </w:p>
+    <w:p>
+      <w:pPr>
+        <w:jc w:val="center"/>
+      </w:pPr>
+      <w:r>
+        <w:drawing>
+          <wp:inline distT="0" distB="0" distL="0" distR="0">
+            <wp:extent cx="6838950" cy="5467350"/>
+            <wp:effectExtent t="0" r="0" b="0" l="0"/>
+            <wp:docPr id="1" name="" descr="" title=""/>
+            <wp:cNvGraphicFramePr>
+              <a:graphicFrameLocks xmlns:a="http://schemas.openxmlformats.org/drawingml/2006/main" noChangeAspect="1"/>
+            </wp:cNvGraphicFramePr>
+            <a:graphic xmlns:a="http://schemas.openxmlformats.org/drawingml/2006/main">
+              <a:graphicData uri="http://schemas.openxmlformats.org/drawingml/2006/picture">
+                <pic:pic xmlns:pic="http://schemas.openxmlformats.org/drawingml/2006/picture">
+                  <pic:nvPicPr>
+                    <pic:cNvPr id="0" name="" descr=""/>
+                    <pic:cNvPicPr>
+                      <a:picLocks noChangeAspect="1" noChangeArrowheads="1"/>
+                    </pic:cNvPicPr>
+                  </pic:nvPicPr>
+                  <pic:blipFill>
+                    <a:blip r:embed="rId14" cstate="none"/>
+                    <a:srcRect/>
+                    <a:stretch>
+                      <a:fillRect/>
+                    </a:stretch>
+                  </pic:blipFill>
+                  <pic:spPr bwMode="auto">
+                    <a:xfrm>
+                      <a:off x="0" y="0"/>
+                      <a:ext cx="6838950" cy="5467350"/>
+                    </a:xfrm>
+                    <a:prstGeom prst="rect">
+                      <a:avLst/>
+                    </a:prstGeom>
+                  </pic:spPr>
+                </pic:pic>
+              </a:graphicData>
+            </a:graphic>
+          </wp:inline>
+        </w:drawing>
+      </w:r>
+    </w:p>
+    <w:p>
+      <w:pPr>
+        <w:spacing w:after="80"/>
+        <w:jc w:val="center"/>
+        <w:rPr>
+          <w:i/>
+          <w:iCs/>
+          <w:sz w:val="18"/>
+          <w:szCs w:val="18"/>
+        </w:rPr>
+      </w:pPr>
+      <w:r>
+        <w:rPr>
+          <w:rFonts w:ascii="Calibri" w:cs="Calibri" w:eastAsia="Calibri" w:hAnsi="Calibri"/>
+          <w:i/>
+          <w:iCs/>
+          <w:sz w:val="18"/>
+          <w:szCs w:val="18"/>
+        </w:rPr>
+        <w:t xml:space="preserve">Διάγραμμα 3/9: Τιμολόγηση και πληρωμές</w:t>
+      </w:r>
+    </w:p>
+    <w:p>
+      <w:pPr>
+        <w:pageBreakBefore/>
+      </w:pPr>
+    </w:p>
+    <w:p>
+      <w:pPr>
+        <w:jc w:val="center"/>
+      </w:pPr>
+      <w:r>
+        <w:drawing>
+          <wp:inline distT="0" distB="0" distL="0" distR="0">
+            <wp:extent cx="5781675" cy="5467350"/>
+            <wp:effectExtent t="0" r="0" b="0" l="0"/>
+            <wp:docPr id="1" name="" descr="" title=""/>
+            <wp:cNvGraphicFramePr>
+              <a:graphicFrameLocks xmlns:a="http://schemas.openxmlformats.org/drawingml/2006/main" noChangeAspect="1"/>
+            </wp:cNvGraphicFramePr>
+            <a:graphic xmlns:a="http://schemas.openxmlformats.org/drawingml/2006/main">
+              <a:graphicData uri="http://schemas.openxmlformats.org/drawingml/2006/picture">
+                <pic:pic xmlns:pic="http://schemas.openxmlformats.org/drawingml/2006/picture">
+                  <pic:nvPicPr>
+                    <pic:cNvPr id="0" name="" descr=""/>
+                    <pic:cNvPicPr>
+                      <a:picLocks noChangeAspect="1" noChangeArrowheads="1"/>
+                    </pic:cNvPicPr>
+                  </pic:nvPicPr>
+                  <pic:blipFill>
+                    <a:blip r:embed="rId15" cstate="none"/>
+                    <a:srcRect/>
+                    <a:stretch>
+                      <a:fillRect/>
+                    </a:stretch>
+                  </pic:blipFill>
+                  <pic:spPr bwMode="auto">
+                    <a:xfrm>
+                      <a:off x="0" y="0"/>
+                      <a:ext cx="5781675" cy="5467350"/>
+                    </a:xfrm>
+                    <a:prstGeom prst="rect">
+                      <a:avLst/>
+                    </a:prstGeom>
+                  </pic:spPr>
+                </pic:pic>
+              </a:graphicData>
+            </a:graphic>
+          </wp:inline>
+        </w:drawing>
+      </w:r>
+    </w:p>
+    <w:p>
+      <w:pPr>
+        <w:spacing w:after="80"/>
+        <w:jc w:val="center"/>
+        <w:rPr>
+          <w:i/>
+          <w:iCs/>
+          <w:sz w:val="18"/>
+          <w:szCs w:val="18"/>
+        </w:rPr>
+      </w:pPr>
+      <w:r>
+        <w:rPr>
+          <w:rFonts w:ascii="Calibri" w:cs="Calibri" w:eastAsia="Calibri" w:hAnsi="Calibri"/>
+          <w:i/>
+          <w:iCs/>
+          <w:sz w:val="18"/>
+          <w:szCs w:val="18"/>
+        </w:rPr>
+        <w:t xml:space="preserve">Διάγραμμα 4/9: Τεχνικοί πεδίου και εργασίες</w:t>
+      </w:r>
+    </w:p>
+    <w:p>
+      <w:pPr>
+        <w:pageBreakBefore/>
+      </w:pPr>
+    </w:p>
+    <w:p>
+      <w:pPr>
+        <w:jc w:val="center"/>
+      </w:pPr>
+      <w:r>
+        <w:drawing>
+          <wp:inline distT="0" distB="0" distL="0" distR="0">
+            <wp:extent cx="6819900" cy="5467350"/>
+            <wp:effectExtent t="0" r="0" b="0" l="0"/>
+            <wp:docPr id="1" name="" descr="" title=""/>
+            <wp:cNvGraphicFramePr>
+              <a:graphicFrameLocks xmlns:a="http://schemas.openxmlformats.org/drawingml/2006/main" noChangeAspect="1"/>
+            </wp:cNvGraphicFramePr>
+            <a:graphic xmlns:a="http://schemas.openxmlformats.org/drawingml/2006/main">
+              <a:graphicData uri="http://schemas.openxmlformats.org/drawingml/2006/picture">
+                <pic:pic xmlns:pic="http://schemas.openxmlformats.org/drawingml/2006/picture">
+                  <pic:nvPicPr>
+                    <pic:cNvPr id="0" name="" descr=""/>
+                    <pic:cNvPicPr>
+                      <a:picLocks noChangeAspect="1" noChangeArrowheads="1"/>
+                    </pic:cNvPicPr>
+                  </pic:nvPicPr>
+                  <pic:blipFill>
+                    <a:blip r:embed="rId16" cstate="none"/>
+                    <a:srcRect/>
+                    <a:stretch>
+                      <a:fillRect/>
+                    </a:stretch>
+                  </pic:blipFill>
+                  <pic:spPr bwMode="auto">
+                    <a:xfrm>
+                      <a:off x="0" y="0"/>
+                      <a:ext cx="6819900" cy="5467350"/>
+                    </a:xfrm>
+                    <a:prstGeom prst="rect">
+                      <a:avLst/>
+                    </a:prstGeom>
+                  </pic:spPr>
+                </pic:pic>
+              </a:graphicData>
+            </a:graphic>
+          </wp:inline>
+        </w:drawing>
+      </w:r>
+    </w:p>
+    <w:p>
+      <w:pPr>
+        <w:spacing w:after="80"/>
+        <w:jc w:val="center"/>
+        <w:rPr>
+          <w:i/>
+          <w:iCs/>
+          <w:sz w:val="18"/>
+          <w:szCs w:val="18"/>
+        </w:rPr>
+      </w:pPr>
+      <w:r>
+        <w:rPr>
+          <w:rFonts w:ascii="Calibri" w:cs="Calibri" w:eastAsia="Calibri" w:hAnsi="Calibri"/>
+          <w:i/>
+          <w:iCs/>
+          <w:sz w:val="18"/>
+          <w:szCs w:val="18"/>
+        </w:rPr>
+        <w:t xml:space="preserve">Διάγραμμα 5/9: Μετρητές, εγκαταστάσεις και εντολές</w:t>
+      </w:r>
+    </w:p>
+    <w:p>
+      <w:pPr>
+        <w:pageBreakBefore/>
+      </w:pPr>
+    </w:p>
+    <w:p>
+      <w:pPr>
+        <w:jc w:val="center"/>
+      </w:pPr>
+      <w:r>
+        <w:drawing>
+          <wp:inline distT="0" distB="0" distL="0" distR="0">
+            <wp:extent cx="6581775" cy="5467350"/>
+            <wp:effectExtent t="0" r="0" b="0" l="0"/>
+            <wp:docPr id="1" name="" descr="" title=""/>
+            <wp:cNvGraphicFramePr>
+              <a:graphicFrameLocks xmlns:a="http://schemas.openxmlformats.org/drawingml/2006/main" noChangeAspect="1"/>
+            </wp:cNvGraphicFramePr>
+            <a:graphic xmlns:a="http://schemas.openxmlformats.org/drawingml/2006/main">
+              <a:graphicData uri="http://schemas.openxmlformats.org/drawingml/2006/picture">
+                <pic:pic xmlns:pic="http://schemas.openxmlformats.org/drawingml/2006/picture">
+                  <pic:nvPicPr>
+                    <pic:cNvPr id="0" name="" descr=""/>
+                    <pic:cNvPicPr>
+                      <a:picLocks noChangeAspect="1" noChangeArrowheads="1"/>
+                    </pic:cNvPicPr>
+                  </pic:nvPicPr>
+                  <pic:blipFill>
+                    <a:blip r:embed="rId17" cstate="none"/>
+                    <a:srcRect/>
+                    <a:stretch>
+                      <a:fillRect/>
+                    </a:stretch>
+                  </pic:blipFill>
+                  <pic:spPr bwMode="auto">
+                    <a:xfrm>
+                      <a:off x="0" y="0"/>
+                      <a:ext cx="6581775" cy="5467350"/>
+                    </a:xfrm>
+                    <a:prstGeom prst="rect">
+                      <a:avLst/>
+                    </a:prstGeom>
+                  </pic:spPr>
+                </pic:pic>
+              </a:graphicData>
+            </a:graphic>
+          </wp:inline>
+        </w:drawing>
+      </w:r>
+    </w:p>
+    <w:p>
+      <w:pPr>
+        <w:spacing w:after="80"/>
+        <w:jc w:val="center"/>
+        <w:rPr>
+          <w:i/>
+          <w:iCs/>
+          <w:sz w:val="18"/>
+          <w:szCs w:val="18"/>
+        </w:rPr>
+      </w:pPr>
+      <w:r>
+        <w:rPr>
+          <w:rFonts w:ascii="Calibri" w:cs="Calibri" w:eastAsia="Calibri" w:hAnsi="Calibri"/>
+          <w:i/>
+          <w:iCs/>
+          <w:sz w:val="18"/>
+          <w:szCs w:val="18"/>
+        </w:rPr>
+        <w:t xml:space="preserve">Διάγραμμα 6/9: Τηλεμετρία και VEE</w:t>
+      </w:r>
+    </w:p>
+    <w:p>
+      <w:pPr>
+        <w:pageBreakBefore/>
+      </w:pPr>
+    </w:p>
+    <w:p>
+      <w:pPr>
+        <w:jc w:val="center"/>
+      </w:pPr>
+      <w:r>
+        <w:drawing>
+          <wp:inline distT="0" distB="0" distL="0" distR="0">
+            <wp:extent cx="9934575" cy="5181600"/>
+            <wp:effectExtent t="0" r="0" b="0" l="0"/>
+            <wp:docPr id="1" name="" descr="" title=""/>
+            <wp:cNvGraphicFramePr>
+              <a:graphicFrameLocks xmlns:a="http://schemas.openxmlformats.org/drawingml/2006/main" noChangeAspect="1"/>
+            </wp:cNvGraphicFramePr>
+            <a:graphic xmlns:a="http://schemas.openxmlformats.org/drawingml/2006/main">
+              <a:graphicData uri="http://schemas.openxmlformats.org/drawingml/2006/picture">
+                <pic:pic xmlns:pic="http://schemas.openxmlformats.org/drawingml/2006/picture">
+                  <pic:nvPicPr>
+                    <pic:cNvPr id="0" name="" descr=""/>
+                    <pic:cNvPicPr>
+                      <a:picLocks noChangeAspect="1" noChangeArrowheads="1"/>
+                    </pic:cNvPicPr>
+                  </pic:nvPicPr>
+                  <pic:blipFill>
+                    <a:blip r:embed="rId18" cstate="none"/>
+                    <a:srcRect/>
+                    <a:stretch>
+                      <a:fillRect/>
+                    </a:stretch>
+                  </pic:blipFill>
+                  <pic:spPr bwMode="auto">
+                    <a:xfrm>
+                      <a:off x="0" y="0"/>
+                      <a:ext cx="9934575" cy="5181600"/>
+                    </a:xfrm>
+                    <a:prstGeom prst="rect">
+                      <a:avLst/>
+                    </a:prstGeom>
+                  </pic:spPr>
+                </pic:pic>
+              </a:graphicData>
+            </a:graphic>
+          </wp:inline>
+        </w:drawing>
+      </w:r>
+    </w:p>
+    <w:p>
+      <w:pPr>
+        <w:spacing w:after="80"/>
+        <w:jc w:val="center"/>
+        <w:rPr>
+          <w:i/>
+          <w:iCs/>
+          <w:sz w:val="18"/>
+          <w:szCs w:val="18"/>
+        </w:rPr>
+      </w:pPr>
+      <w:r>
+        <w:rPr>
+          <w:rFonts w:ascii="Calibri" w:cs="Calibri" w:eastAsia="Calibri" w:hAnsi="Calibri"/>
+          <w:i/>
+          <w:iCs/>
+          <w:sz w:val="18"/>
+          <w:szCs w:val="18"/>
+        </w:rPr>
+        <w:t xml:space="preserve">Διάγραμμα 7/9: Τοπολογία δικτύου και συγκεντρωτικά</w:t>
+      </w:r>
+    </w:p>
+    <w:p>
+      <w:pPr>
+        <w:pageBreakBefore/>
+      </w:pPr>
+    </w:p>
+    <w:p>
+      <w:pPr>
+        <w:jc w:val="center"/>
+      </w:pPr>
+      <w:r>
+        <w:drawing>
+          <wp:inline distT="0" distB="0" distL="0" distR="0">
+            <wp:extent cx="9172575" cy="5467350"/>
+            <wp:effectExtent t="0" r="0" b="0" l="0"/>
+            <wp:docPr id="1" name="" descr="" title=""/>
+            <wp:cNvGraphicFramePr>
+              <a:graphicFrameLocks xmlns:a="http://schemas.openxmlformats.org/drawingml/2006/main" noChangeAspect="1"/>
+            </wp:cNvGraphicFramePr>
+            <a:graphic xmlns:a="http://schemas.openxmlformats.org/drawingml/2006/main">
+              <a:graphicData uri="http://schemas.openxmlformats.org/drawingml/2006/picture">
+                <pic:pic xmlns:pic="http://schemas.openxmlformats.org/drawingml/2006/picture">
+                  <pic:nvPicPr>
+                    <pic:cNvPr id="0" name="" descr=""/>
+                    <pic:cNvPicPr>
+                      <a:picLocks noChangeAspect="1" noChangeArrowheads="1"/>
+                    </pic:cNvPicPr>
+                  </pic:nvPicPr>
+                  <pic:blipFill>
+                    <a:blip r:embed="rId19" cstate="none"/>
+                    <a:srcRect/>
+                    <a:stretch>
+                      <a:fillRect/>
+                    </a:stretch>
+                  </pic:blipFill>
+                  <pic:spPr bwMode="auto">
+                    <a:xfrm>
+                      <a:off x="0" y="0"/>
+                      <a:ext cx="9172575" cy="5467350"/>
+                    </a:xfrm>
+                    <a:prstGeom prst="rect">
+                      <a:avLst/>
+                    </a:prstGeom>
+                  </pic:spPr>
+                </pic:pic>
+              </a:graphicData>
+            </a:graphic>
+          </wp:inline>
+        </w:drawing>
+      </w:r>
+    </w:p>
+    <w:p>
+      <w:pPr>
+        <w:spacing w:after="80"/>
+        <w:jc w:val="center"/>
+        <w:rPr>
+          <w:i/>
+          <w:iCs/>
+          <w:sz w:val="18"/>
+          <w:szCs w:val="18"/>
+        </w:rPr>
+      </w:pPr>
+      <w:r>
+        <w:rPr>
+          <w:rFonts w:ascii="Calibri" w:cs="Calibri" w:eastAsia="Calibri" w:hAnsi="Calibri"/>
+          <w:i/>
+          <w:iCs/>
+          <w:sz w:val="18"/>
+          <w:szCs w:val="18"/>
+        </w:rPr>
+        <w:t xml:space="preserve">Διάγραμμα 8/9: Προμηθευτές και aggregators</w:t>
+      </w:r>
+    </w:p>
+    <w:p>
+      <w:pPr>
+        <w:pageBreakBefore/>
+      </w:pPr>
+    </w:p>
+    <w:p>
+      <w:pPr>
+        <w:jc w:val="center"/>
+      </w:pPr>
+      <w:r>
+        <w:drawing>
+          <wp:inline distT="0" distB="0" distL="0" distR="0">
+            <wp:extent cx="7038975" cy="5467350"/>
+            <wp:effectExtent t="0" r="0" b="0" l="0"/>
+            <wp:docPr id="1" name="" descr="" title=""/>
+            <wp:cNvGraphicFramePr>
+              <a:graphicFrameLocks xmlns:a="http://schemas.openxmlformats.org/drawingml/2006/main" noChangeAspect="1"/>
+            </wp:cNvGraphicFramePr>
+            <a:graphic xmlns:a="http://schemas.openxmlformats.org/drawingml/2006/main">
+              <a:graphicData uri="http://schemas.openxmlformats.org/drawingml/2006/picture">
+                <pic:pic xmlns:pic="http://schemas.openxmlformats.org/drawingml/2006/picture">
+                  <pic:nvPicPr>
+                    <pic:cNvPr id="0" name="" descr=""/>
+                    <pic:cNvPicPr>
+                      <a:picLocks noChangeAspect="1" noChangeArrowheads="1"/>
+                    </pic:cNvPicPr>
+                  </pic:nvPicPr>
+                  <pic:blipFill>
+                    <a:blip r:embed="rId20" cstate="none"/>
+                    <a:srcRect/>
+                    <a:stretch>
+                      <a:fillRect/>
+                    </a:stretch>
+                  </pic:blipFill>
+                  <pic:spPr bwMode="auto">
+                    <a:xfrm>
+                      <a:off x="0" y="0"/>
+                      <a:ext cx="7038975" cy="5467350"/>
+                    </a:xfrm>
+                    <a:prstGeom prst="rect">
+                      <a:avLst/>
+                    </a:prstGeom>
+                  </pic:spPr>
+                </pic:pic>
+              </a:graphicData>
+            </a:graphic>
+          </wp:inline>
+        </w:drawing>
+      </w:r>
+    </w:p>
+    <w:p>
+      <w:pPr>
+        <w:spacing w:after="80"/>
+        <w:jc w:val="center"/>
+        <w:rPr>
+          <w:i/>
+          <w:iCs/>
+          <w:sz w:val="18"/>
+          <w:szCs w:val="18"/>
+        </w:rPr>
+      </w:pPr>
+      <w:r>
+        <w:rPr>
+          <w:rFonts w:ascii="Calibri" w:cs="Calibri" w:eastAsia="Calibri" w:hAnsi="Calibri"/>
+          <w:i/>
+          <w:iCs/>
+          <w:sz w:val="18"/>
+          <w:szCs w:val="18"/>
+        </w:rPr>
+        <w:t xml:space="preserve">Διάγραμμα 9/9: GDPR, αρχείο ελέγχου και συμβάντα</w:t>
+      </w:r>
+    </w:p>
+    <w:p>
+      <w:pPr>
+        <w:sectPr>
+          <w:footerReference w:type="default" r:id="rId9"/>
+          <w:pgSz w:w="16838" w:h="11906" w:orient="landscape"/>
+          <w:pgMar w:top="600" w:right="600" w:bottom="600" w:left="600" w:header="708" w:footer="708" w:gutter="0"/>
+          <w:pgNumType/>
+          <w:docGrid w:linePitch="360"/>
+        </w:sectPr>
+      </w:pPr>
+    </w:p>
+    <w:p>
+      <w:pPr>
+        <w:pStyle w:val="Heading1"/>
+        <w:spacing w:after="120" w:before="120"/>
+      </w:pPr>
+      <w:r>
+        <w:rPr>
+          <w:rFonts w:ascii="Calibri" w:cs="Calibri" w:eastAsia="Calibri" w:hAnsi="Calibri"/>
+        </w:rPr>
+        <w:t xml:space="preserve">4. Σχεσιακό σχήμα σε T-SQL</w:t>
+      </w:r>
+    </w:p>
+    <w:p>
+      <w:pPr>
+        <w:spacing w:after="80"/>
+        <w:rPr>
+          <w:sz w:val="19"/>
+          <w:szCs w:val="19"/>
+        </w:rPr>
+      </w:pPr>
+      <w:r>
+        <w:rPr>
+          <w:rFonts w:ascii="Calibri" w:cs="Calibri" w:eastAsia="Calibri" w:hAnsi="Calibri"/>
+          <w:sz w:val="19"/>
+          <w:szCs w:val="19"/>
+        </w:rPr>
         <w:t xml:space="preserve">Το σχήμα προκύπτει από το διάγραμμα ER με την αντιστοίχιση του βιβλίου (Elmasri &amp; Navathe, κεφ. 9): 62 πίνακες με τύπους δεδομένων T-SQL, πρωτεύοντα και ξένα κλειδιά (101), περιορισμούς CHECK (106), UNIQUE (18 και 3 φιλτραρισμένοι) και DEFAULT. Κάθε περιορισμός έχει όνομα της μορφής PK_, FK_ΠΙΝΑΚΑΣ_ΣΥΣΧΕΤΙΣΗ, UQ_, CK_, DF_. Το σχήμα δοκιμάστηκε σε Microsoft SQL Server 2025 με 76 ελέγχους περιορισμών.</w:t>
       </w:r>
     </w:p>
@@ -12069,7 +12766,7 @@
       </w:r>
     </w:p>
     <w:sectPr>
-      <w:footerReference w:type="default" r:id="rId9"/>
+      <w:footerReference w:type="default" r:id="rId10"/>
       <w:pgSz w:w="11906" w:h="16838" w:orient="portrait"/>
       <w:pgMar w:top="1000" w:right="800" w:bottom="1000" w:left="800" w:header="708" w:footer="708" w:gutter="0"/>
       <w:pgNumType/>
@@ -12179,6 +12876,35 @@
 </file>
 
 <file path=word/footer3.xml><?xml version="1.0" encoding="utf-8"?>
+<w:ftr xmlns:wpc="http://schemas.microsoft.com/office/word/2010/wordprocessingCanvas" xmlns:mc="http://schemas.openxmlformats.org/markup-compatibility/2006" xmlns:o="urn:schemas-microsoft-com:office:office" xmlns:r="http://schemas.openxmlformats.org/officeDocument/2006/relationships" xmlns:m="http://schemas.openxmlformats.org/officeDocument/2006/math" xmlns:v="urn:schemas-microsoft-com:vml" xmlns:wp14="http://schemas.microsoft.com/office/word/2010/wordprocessingDrawing" xmlns:wp="http://schemas.openxmlformats.org/drawingml/2006/wordprocessingDrawing" xmlns:w10="urn:schemas-microsoft-com:office:word" xmlns:w="http://schemas.openxmlformats.org/wordprocessingml/2006/main" xmlns:w14="http://schemas.microsoft.com/office/word/2010/wordml" xmlns:w15="http://schemas.microsoft.com/office/word/2012/wordml" xmlns:wpg="http://schemas.microsoft.com/office/word/2010/wordprocessingGroup" xmlns:wpi="http://schemas.microsoft.com/office/word/2010/wordprocessingInk" xmlns:wne="http://schemas.microsoft.com/office/word/2006/wordml" xmlns:wps="http://schemas.microsoft.com/office/word/2010/wordprocessingShape">
+  <w:p>
+    <w:pPr>
+      <w:jc w:val="center"/>
+    </w:pPr>
+    <w:r>
+      <w:rPr>
+        <w:rFonts w:ascii="Calibri" w:cs="Calibri" w:eastAsia="Calibri" w:hAnsi="Calibri"/>
+        <w:sz w:val="16"/>
+        <w:szCs w:val="16"/>
+      </w:rPr>
+      <w:t xml:space="preserve">ΕΠΛ342 Φάση Α · Ομάδα &lt;team-number&gt; · </w:t>
+    </w:r>
+    <w:r>
+      <w:rPr>
+        <w:rFonts w:ascii="Calibri" w:cs="Calibri" w:eastAsia="Calibri" w:hAnsi="Calibri"/>
+        <w:sz w:val="16"/>
+        <w:szCs w:val="16"/>
+      </w:rPr>
+      <w:fldChar w:fldCharType="begin"/>
+      <w:instrText xml:space="preserve">PAGE</w:instrText>
+      <w:fldChar w:fldCharType="separate"/>
+      <w:fldChar w:fldCharType="end"/>
+    </w:r>
+  </w:p>
+</w:ftr>
+</file>
+
+<file path=word/footer4.xml><?xml version="1.0" encoding="utf-8"?>
 <w:ftr xmlns:wpc="http://schemas.microsoft.com/office/word/2010/wordprocessingCanvas" xmlns:mc="http://schemas.openxmlformats.org/markup-compatibility/2006" xmlns:o="urn:schemas-microsoft-com:office:office" xmlns:r="http://schemas.openxmlformats.org/officeDocument/2006/relationships" xmlns:m="http://schemas.openxmlformats.org/officeDocument/2006/math" xmlns:v="urn:schemas-microsoft-com:vml" xmlns:wp14="http://schemas.microsoft.com/office/word/2010/wordprocessingDrawing" xmlns:wp="http://schemas.openxmlformats.org/drawingml/2006/wordprocessingDrawing" xmlns:w10="urn:schemas-microsoft-com:office:word" xmlns:w="http://schemas.openxmlformats.org/wordprocessingml/2006/main" xmlns:w14="http://schemas.microsoft.com/office/word/2010/wordml" xmlns:w15="http://schemas.microsoft.com/office/word/2012/wordml" xmlns:wpg="http://schemas.microsoft.com/office/word/2010/wordprocessingGroup" xmlns:wpi="http://schemas.microsoft.com/office/word/2010/wordprocessingInk" xmlns:wne="http://schemas.microsoft.com/office/word/2006/wordml" xmlns:wps="http://schemas.microsoft.com/office/word/2010/wordprocessingShape">
   <w:p>
     <w:pPr>

</xml_diff>

<commit_message>
model: drop the redundant BUYS relationship (CONSUMER-SERVICE_PURCHASE)
Every purchase is CHARGED_IN exactly one invoice (total) and the invoice is ISSUED_TO
its consumer, so the buyer is already the invoice's consumer. SERVICE_PURCHASE loses
UserID and FK_SERVICE_PURCHASE_BUYS; R4, R6, R7 and D24 no longer keep a separate buyer
equal to the invoice's consumer. Regenerated create.sql, test.sql, both .erdplus files,
the ER and schema pages, the ER render, the SQL Server catalog and the nine table
diagrams, and phase-a.docx. 91 relationships, 100 FK, 323 columns; 76/76 tests on
SQL Server 2025 CU9.

Co-Authored-By: Claude Opus 5.5 (1M context) <noreply@anthropic.com>
Claude-Session: https://claude.ai/code/session_01VU2NhTqL5JCdkxvnJAX8YD
</commit_message>
<xml_diff>
--- a/deliverables/phase-a/phase-a.docx
+++ b/deliverables/phase-a/phase-a.docx
@@ -189,7 +189,7 @@
       <w:r>
         <w:drawing>
           <wp:inline distT="0" distB="0" distL="0" distR="0">
-            <wp:extent cx="9934575" cy="4772025"/>
+            <wp:extent cx="9934575" cy="4924425"/>
             <wp:effectExtent t="0" r="0" b="0" l="0"/>
             <wp:docPr id="1" name="" descr="" title=""/>
             <wp:cNvGraphicFramePr>
@@ -214,7 +214,7 @@
                   <pic:spPr bwMode="auto">
                     <a:xfrm>
                       <a:off x="0" y="0"/>
-                      <a:ext cx="9934575" cy="4772025"/>
+                      <a:ext cx="9934575" cy="4924425"/>
                     </a:xfrm>
                     <a:prstGeom prst="rect">
                       <a:avLst/>
@@ -519,7 +519,7 @@
       <w:r>
         <w:drawing>
           <wp:inline distT="0" distB="0" distL="0" distR="0">
-            <wp:extent cx="5705475" cy="4000500"/>
+            <wp:extent cx="6067425" cy="4000500"/>
             <wp:effectExtent t="0" r="0" b="0" l="0"/>
             <wp:docPr id="1" name="" descr="" title=""/>
             <wp:cNvGraphicFramePr>
@@ -544,7 +544,7 @@
                   <pic:spPr bwMode="auto">
                     <a:xfrm>
                       <a:off x="0" y="0"/>
-                      <a:ext cx="5705475" cy="4000500"/>
+                      <a:ext cx="6067425" cy="4000500"/>
                     </a:xfrm>
                     <a:prstGeom prst="rect">
                       <a:avLst/>
@@ -663,7 +663,7 @@
       <w:r>
         <w:drawing>
           <wp:inline distT="0" distB="0" distL="0" distR="0">
-            <wp:extent cx="6838950" cy="5467350"/>
+            <wp:extent cx="7277100" cy="5467350"/>
             <wp:effectExtent t="0" r="0" b="0" l="0"/>
             <wp:docPr id="1" name="" descr="" title=""/>
             <wp:cNvGraphicFramePr>
@@ -688,7 +688,7 @@
                   <pic:spPr bwMode="auto">
                     <a:xfrm>
                       <a:off x="0" y="0"/>
-                      <a:ext cx="6838950" cy="5467350"/>
+                      <a:ext cx="7277100" cy="5467350"/>
                     </a:xfrm>
                     <a:prstGeom prst="rect">
                       <a:avLst/>
@@ -1192,7 +1192,7 @@
           <w:sz w:val="19"/>
           <w:szCs w:val="19"/>
         </w:rPr>
-        <w:t xml:space="preserve">Το σχήμα προκύπτει από το διάγραμμα ER με την αντιστοίχιση του βιβλίου (Elmasri &amp; Navathe, κεφ. 9): 62 πίνακες με τύπους δεδομένων T-SQL, πρωτεύοντα και ξένα κλειδιά (101), περιορισμούς CHECK (106), UNIQUE (18 και 3 φιλτραρισμένοι) και DEFAULT. Κάθε περιορισμός έχει όνομα της μορφής PK_, FK_ΠΙΝΑΚΑΣ_ΣΥΣΧΕΤΙΣΗ, UQ_, CK_, DF_. Το σχήμα δοκιμάστηκε σε Microsoft SQL Server 2025 με 76 ελέγχους περιορισμών.</w:t>
+        <w:t xml:space="preserve">Το σχήμα προκύπτει από το διάγραμμα ER με την αντιστοίχιση του βιβλίου (Elmasri &amp; Navathe, κεφ. 9): 62 πίνακες με τύπους δεδομένων T-SQL, πρωτεύοντα και ξένα κλειδιά (100), περιορισμούς CHECK (106), UNIQUE (18 και 3 φιλτραρισμένοι) και DEFAULT. Κάθε περιορισμός έχει όνομα της μορφής PK_, FK_ΠΙΝΑΚΑΣ_ΣΥΣΧΕΤΙΣΗ, UQ_, CK_, DF_. Το σχήμα δοκιμάστηκε σε Microsoft SQL Server 2025 με 76 ελέγχους περιορισμών.</w:t>
       </w:r>
     </w:p>
     <w:p>
@@ -6197,19 +6197,6 @@
           <w:sz w:val="14"/>
           <w:szCs w:val="14"/>
         </w:rPr>
-        <w:t xml:space="preserve">    UserID INT NOT NULL,</w:t>
-      </w:r>
-    </w:p>
-    <w:p>
-      <w:pPr>
-        <w:spacing w:after="0" w:line="220"/>
-      </w:pPr>
-      <w:r>
-        <w:rPr>
-          <w:rFonts w:ascii="Consolas" w:cs="Consolas" w:eastAsia="Consolas" w:hAnsi="Consolas"/>
-          <w:sz w:val="14"/>
-          <w:szCs w:val="14"/>
-        </w:rPr>
         <w:t xml:space="preserve">    ServiceTypeID INT NOT NULL,</w:t>
       </w:r>
     </w:p>
@@ -6250,19 +6237,6 @@
           <w:szCs w:val="14"/>
         </w:rPr>
         <w:t xml:space="preserve">    CONSTRAINT PK_SERVICE_PURCHASE PRIMARY KEY (PurchaseID),</w:t>
-      </w:r>
-    </w:p>
-    <w:p>
-      <w:pPr>
-        <w:spacing w:after="0" w:line="220"/>
-      </w:pPr>
-      <w:r>
-        <w:rPr>
-          <w:rFonts w:ascii="Consolas" w:cs="Consolas" w:eastAsia="Consolas" w:hAnsi="Consolas"/>
-          <w:sz w:val="14"/>
-          <w:szCs w:val="14"/>
-        </w:rPr>
-        <w:t xml:space="preserve">    CONSTRAINT FK_SERVICE_PURCHASE_BUYS FOREIGN KEY (UserID) REFERENCES CONSUMER (UserID),</w:t>
       </w:r>
     </w:p>
     <w:p>

</xml_diff>